<commit_message>
Atualizar relatorio com filtros de categoria e criterio de reflow
</commit_message>
<xml_diff>
--- a/docs/Relatório RELIC - Unidade 2.docx
+++ b/docs/Relatório RELIC - Unidade 2.docx
@@ -3685,28 +3685,7 @@
         <w:spacing w:after="60" w:line="270"/>
       </w:pPr>
       <w:r>
-        <w:t xml:space="preserve">Microinterações suaves que reforçam as ações sem prejudicar o desempenho.</w:t>
-      </w:r>
-    </w:p>
-    <w:p>
-      <w:pPr>
-        <w:pStyle w:val="Heading1"/>
-      </w:pPr>
-      <w:r>
-        <w:t xml:space="preserve">7. Aplicação de acessibilidade digital</w:t>
-      </w:r>
-    </w:p>
-    <w:p>
-      <w:pPr>
-        <w:spacing w:after="120" w:line="276"/>
-        <w:jc w:val="both"/>
-      </w:pPr>
-      <w:r>
-        <w:rPr>
-          <w:i w:val="false"/>
-          <w:iCs w:val="false"/>
-        </w:rPr>
-        <w:t xml:space="preserve">As melhorias de acessibilidade tomaram como base as diretrizes WCAG 2.1, nível AA. Foram aplicadas, no mínimo, as seguintes melhorias, todas com fundamentação técnica:</w:t>
+        <w:t xml:space="preserve">Filtros por estado, autenticidade e disponibilidade em cada categoria, com ordenação por preço e busca interna, apoiando a flexibilidade e a eficiência de uso.</w:t>
       </w:r>
     </w:p>
     <w:p>
@@ -3719,7 +3698,28 @@
         <w:spacing w:after="60" w:line="270"/>
       </w:pPr>
       <w:r>
-        <w:t xml:space="preserve">Foco sempre visível para navegação por teclado (WCAG 2.4.7), permitindo que o usuário identifique onde está na interface.</w:t>
+        <w:t xml:space="preserve">Microinterações suaves que reforçam as ações sem prejudicar o desempenho.</w:t>
+      </w:r>
+    </w:p>
+    <w:p>
+      <w:pPr>
+        <w:pStyle w:val="Heading1"/>
+      </w:pPr>
+      <w:r>
+        <w:t xml:space="preserve">7. Aplicação de acessibilidade digital</w:t>
+      </w:r>
+    </w:p>
+    <w:p>
+      <w:pPr>
+        <w:spacing w:after="120" w:line="276"/>
+        <w:jc w:val="both"/>
+      </w:pPr>
+      <w:r>
+        <w:rPr>
+          <w:i w:val="false"/>
+          <w:iCs w:val="false"/>
+        </w:rPr>
+        <w:t xml:space="preserve">As melhorias de acessibilidade tomaram como base as diretrizes WCAG 2.1, nível AA. Foram aplicadas, no mínimo, as seguintes melhorias, todas com fundamentação técnica:</w:t>
       </w:r>
     </w:p>
     <w:p>
@@ -3732,7 +3732,7 @@
         <w:spacing w:after="60" w:line="270"/>
       </w:pPr>
       <w:r>
-        <w:t xml:space="preserve">Skip link e marcos semânticos (landmarks), além de aria-current na navegação (WCAG 2.4.1), agilizando o acesso ao conteúdo.</w:t>
+        <w:t xml:space="preserve">Foco sempre visível para navegação por teclado (WCAG 2.4.7), permitindo que o usuário identifique onde está na interface.</w:t>
       </w:r>
     </w:p>
     <w:p>
@@ -3745,7 +3745,7 @@
         <w:spacing w:after="60" w:line="270"/>
       </w:pPr>
       <w:r>
-        <w:t xml:space="preserve">Regiões aria-live para feedback de toasts e de formulários (WCAG 4.1.3), tornando as mensagens perceptíveis por leitores de tela.</w:t>
+        <w:t xml:space="preserve">Skip link e marcos semânticos (landmarks), além de aria-current na navegação (WCAG 2.4.1), agilizando o acesso ao conteúdo.</w:t>
       </w:r>
     </w:p>
     <w:p>
@@ -3758,7 +3758,7 @@
         <w:spacing w:after="60" w:line="270"/>
       </w:pPr>
       <w:r>
-        <w:t xml:space="preserve">Busca implementada como combobox acessível (role, aria-expanded, aria-controls e aria-activedescendant), navegável por setas, Enter e Esc.</w:t>
+        <w:t xml:space="preserve">Regiões aria-live para feedback de toasts e de formulários (WCAG 4.1.3), tornando as mensagens perceptíveis por leitores de tela.</w:t>
       </w:r>
     </w:p>
     <w:p>
@@ -3771,7 +3771,7 @@
         <w:spacing w:after="60" w:line="270"/>
       </w:pPr>
       <w:r>
-        <w:t xml:space="preserve">Erros de formulário acessíveis com aria-invalid, aria-describedby e foco movido ao primeiro erro (WCAG 3.3.1).</w:t>
+        <w:t xml:space="preserve">Busca implementada como combobox acessível (role, aria-expanded, aria-controls e aria-activedescendant), navegável por setas, Enter e Esc.</w:t>
       </w:r>
     </w:p>
     <w:p>
@@ -3784,7 +3784,7 @@
         <w:spacing w:after="60" w:line="270"/>
       </w:pPr>
       <w:r>
-        <w:t xml:space="preserve">Contraste de cores revisado para AA (WCAG 1.4.3) nas duas paletas (clara e escura), que foram desenhadas para contrastar entre si.</w:t>
+        <w:t xml:space="preserve">Erros de formulário acessíveis com aria-invalid, aria-describedby e foco movido ao primeiro erro (WCAG 3.3.1).</w:t>
       </w:r>
     </w:p>
     <w:p>
@@ -3797,7 +3797,7 @@
         <w:spacing w:after="60" w:line="270"/>
       </w:pPr>
       <w:r>
-        <w:t xml:space="preserve">Respeito à preferência de movimento reduzido (prefers-reduced-motion, WCAG 2.3.3) em todas as animações.</w:t>
+        <w:t xml:space="preserve">Contraste de cores revisado para AA (WCAG 1.4.3) nas duas paletas (clara e escura), que foram desenhadas para contrastar entre si.</w:t>
       </w:r>
     </w:p>
     <w:p>
@@ -3810,7 +3810,7 @@
         <w:spacing w:after="60" w:line="270"/>
       </w:pPr>
       <w:r>
-        <w:t xml:space="preserve">Alvos de toque com no mínimo 44x44px e layout responsivo (acessibilidade móvel, WCAG 2.5.5), sem rolagem horizontal no celular.</w:t>
+        <w:t xml:space="preserve">Respeito à preferência de movimento reduzido (prefers-reduced-motion, WCAG 2.3.3) em todas as animações.</w:t>
       </w:r>
     </w:p>
     <w:p>
@@ -3823,7 +3823,7 @@
         <w:spacing w:after="60" w:line="270"/>
       </w:pPr>
       <w:r>
-        <w:t xml:space="preserve">Identificação da finalidade dos campos com autocomplete e inputmode (WCAG 1.3.5), facilitando o preenchimento e o autofill no celular.</w:t>
+        <w:t xml:space="preserve">Alvos de toque com no mínimo 44x44px e layout responsivo (acessibilidade móvel, WCAG 2.5.5), sem rolagem horizontal no celular.</w:t>
       </w:r>
     </w:p>
     <w:p>
@@ -3836,62 +3836,7 @@
         <w:spacing w:after="60" w:line="270"/>
       </w:pPr>
       <w:r>
-        <w:t xml:space="preserve">Título de página específico por rota (WCAG 2.4.2), melhorando a orientação.</w:t>
-      </w:r>
-    </w:p>
-    <w:p>
-      <w:pPr>
-        <w:pStyle w:val="Heading1"/>
-      </w:pPr>
-      <w:r>
-        <w:t xml:space="preserve">8. Privacidade, segurança e proteção de dados (LGPD)</w:t>
-      </w:r>
-    </w:p>
-    <w:p>
-      <w:pPr>
-        <w:spacing w:after="120" w:line="276"/>
-        <w:jc w:val="both"/>
-      </w:pPr>
-      <w:r>
-        <w:rPr>
-          <w:i w:val="false"/>
-          <w:iCs w:val="false"/>
-        </w:rPr>
-        <w:t xml:space="preserve">Embora o RELIC seja um protótipo acadêmico sem backend real, foram incorporadas decisões de privacidade e segurança para aumentar a confiança do usuário durante a interação. Os dados de cadastro, sessão, carrinho e favoritos são armazenados apenas localmente no navegador, com uso de localStorage, sem envio para servidores externos.</w:t>
-      </w:r>
-    </w:p>
-    <w:p>
-      <w:pPr>
-        <w:spacing w:after="120" w:line="276"/>
-        <w:jc w:val="both"/>
-      </w:pPr>
-      <w:r>
-        <w:rPr>
-          <w:i w:val="false"/>
-          <w:iCs w:val="false"/>
-        </w:rPr>
-        <w:t xml:space="preserve">A interface foi ajustada para informar claramente quais dados são utilizados, com qual finalidade e onde ficam armazenados. Também foi adicionada uma área de controle de dados, permitindo visualizar, exportar e apagar as informações simuladas. Essa decisão reforça princípios de transparência, minimização de dados, controle do titular e prevenção de riscos, alinhando o protótipo aos conceitos de proteção de dados e qualidade de uso.</w:t>
-      </w:r>
-    </w:p>
-    <w:p>
-      <w:pPr>
-        <w:spacing w:after="120" w:line="276"/>
-        <w:jc w:val="both"/>
-      </w:pPr>
-      <w:r>
-        <w:rPr>
-          <w:i w:val="false"/>
-          <w:iCs w:val="false"/>
-        </w:rPr>
-        <w:t xml:space="preserve">A Lei Geral de Proteção de Dados (Lei nº 13.709/2018) tem como objetivo proteger direitos fundamentais de liberdade e privacidade e regular o tratamento de dados pessoais em meios digitais. Por isso, mesmo em um protótipo, foram aplicadas decisões de interface voltadas à transparência, ao controle do usuário e à redução da coleta de dados.</w:t>
-      </w:r>
-    </w:p>
-    <w:p>
-      <w:pPr>
-        <w:pStyle w:val="Heading2"/>
-      </w:pPr>
-      <w:r>
-        <w:t xml:space="preserve">8.1. Medidas implementadas</w:t>
+        <w:t xml:space="preserve">Conteúdo adaptável sem transbordamento (reflow, WCAG 1.4.10): as imagens dos produtos e os cartões de itens relacionados se ajustam à moldura mesmo com zoom do navegador ou fontes ampliadas, evitando vazamento de conteúdo.</w:t>
       </w:r>
     </w:p>
     <w:p>
@@ -3904,7 +3849,7 @@
         <w:spacing w:after="60" w:line="270"/>
       </w:pPr>
       <w:r>
-        <w:t xml:space="preserve">Página de Privacidade explicando quais dados são usados, finalidade, local de armazenamento, prazo e ausência de compartilhamento.</w:t>
+        <w:t xml:space="preserve">Identificação da finalidade dos campos com autocomplete e inputmode (WCAG 1.3.5), facilitando o preenchimento e o autofill no celular.</w:t>
       </w:r>
     </w:p>
     <w:p>
@@ -3917,7 +3862,62 @@
         <w:spacing w:after="60" w:line="270"/>
       </w:pPr>
       <w:r>
-        <w:t xml:space="preserve">Minimização de dados: o cadastro pede apenas nome, e-mail e uma senha fictícia.</w:t>
+        <w:t xml:space="preserve">Título de página específico por rota (WCAG 2.4.2), melhorando a orientação.</w:t>
+      </w:r>
+    </w:p>
+    <w:p>
+      <w:pPr>
+        <w:pStyle w:val="Heading1"/>
+      </w:pPr>
+      <w:r>
+        <w:t xml:space="preserve">8. Privacidade, segurança e proteção de dados (LGPD)</w:t>
+      </w:r>
+    </w:p>
+    <w:p>
+      <w:pPr>
+        <w:spacing w:after="120" w:line="276"/>
+        <w:jc w:val="both"/>
+      </w:pPr>
+      <w:r>
+        <w:rPr>
+          <w:i w:val="false"/>
+          <w:iCs w:val="false"/>
+        </w:rPr>
+        <w:t xml:space="preserve">Embora o RELIC seja um protótipo acadêmico sem backend real, foram incorporadas decisões de privacidade e segurança para aumentar a confiança do usuário durante a interação. Os dados de cadastro, sessão, carrinho e favoritos são armazenados apenas localmente no navegador, com uso de localStorage, sem envio para servidores externos.</w:t>
+      </w:r>
+    </w:p>
+    <w:p>
+      <w:pPr>
+        <w:spacing w:after="120" w:line="276"/>
+        <w:jc w:val="both"/>
+      </w:pPr>
+      <w:r>
+        <w:rPr>
+          <w:i w:val="false"/>
+          <w:iCs w:val="false"/>
+        </w:rPr>
+        <w:t xml:space="preserve">A interface foi ajustada para informar claramente quais dados são utilizados, com qual finalidade e onde ficam armazenados. Também foi adicionada uma área de controle de dados, permitindo visualizar, exportar e apagar as informações simuladas. Essa decisão reforça princípios de transparência, minimização de dados, controle do titular e prevenção de riscos, alinhando o protótipo aos conceitos de proteção de dados e qualidade de uso.</w:t>
+      </w:r>
+    </w:p>
+    <w:p>
+      <w:pPr>
+        <w:spacing w:after="120" w:line="276"/>
+        <w:jc w:val="both"/>
+      </w:pPr>
+      <w:r>
+        <w:rPr>
+          <w:i w:val="false"/>
+          <w:iCs w:val="false"/>
+        </w:rPr>
+        <w:t xml:space="preserve">A Lei Geral de Proteção de Dados (Lei nº 13.709/2018) tem como objetivo proteger direitos fundamentais de liberdade e privacidade e regular o tratamento de dados pessoais em meios digitais. Por isso, mesmo em um protótipo, foram aplicadas decisões de interface voltadas à transparência, ao controle do usuário e à redução da coleta de dados.</w:t>
+      </w:r>
+    </w:p>
+    <w:p>
+      <w:pPr>
+        <w:pStyle w:val="Heading2"/>
+      </w:pPr>
+      <w:r>
+        <w:t xml:space="preserve">8.1. Medidas implementadas</w:t>
       </w:r>
     </w:p>
     <w:p>
@@ -3930,7 +3930,7 @@
         <w:spacing w:after="60" w:line="270"/>
       </w:pPr>
       <w:r>
-        <w:t xml:space="preserve">Consentimento informado no cadastro, com link para o aviso de privacidade.</w:t>
+        <w:t xml:space="preserve">Página de Privacidade explicando quais dados são usados, finalidade, local de armazenamento, prazo e ausência de compartilhamento.</w:t>
       </w:r>
     </w:p>
     <w:p>
@@ -3943,7 +3943,7 @@
         <w:spacing w:after="60" w:line="270"/>
       </w:pPr>
       <w:r>
-        <w:t xml:space="preserve">Área “Meus dados e privacidade” no perfil, com opções de baixar (portabilidade, em JSON) e apagar os dados (com confirmação e feedback acessível).</w:t>
+        <w:t xml:space="preserve">Minimização de dados: o cadastro pede apenas nome, e-mail e uma senha fictícia.</w:t>
       </w:r>
     </w:p>
     <w:p>
@@ -3956,7 +3956,7 @@
         <w:spacing w:after="60" w:line="270"/>
       </w:pPr>
       <w:r>
-        <w:t xml:space="preserve">Aviso de “compra simulada” no checkout e confirmação obrigatória antes de finalizar, evitando que o usuário pense tratar-se de um pagamento real.</w:t>
+        <w:t xml:space="preserve">Consentimento informado no cadastro, com link para o aviso de privacidade.</w:t>
       </w:r>
     </w:p>
     <w:p>
@@ -3969,7 +3969,7 @@
         <w:spacing w:after="60" w:line="270"/>
       </w:pPr>
       <w:r>
-        <w:t xml:space="preserve">Mostrar/ocultar senha e mensagem de login genérica, que não revela se um e-mail está cadastrado (redução de exposição de informação).</w:t>
+        <w:t xml:space="preserve">Área “Meus dados e privacidade” no perfil, com opções de baixar (portabilidade, em JSON) e apagar os dados (com confirmação e feedback acessível).</w:t>
       </w:r>
     </w:p>
     <w:p>
@@ -3982,56 +3982,7 @@
         <w:spacing w:after="60" w:line="270"/>
       </w:pPr>
       <w:r>
-        <w:t xml:space="preserve">Banner de protótipo no rodapé, reforçando que os dados ficam apenas no navegador e podem ser apagados.</w:t>
-      </w:r>
-    </w:p>
-    <w:p>
-      <w:pPr>
-        <w:pStyle w:val="Heading1"/>
-      </w:pPr>
-      <w:r>
-        <w:t xml:space="preserve">9. Validação com usuários</w:t>
-      </w:r>
-    </w:p>
-    <w:p>
-      <w:pPr>
-        <w:spacing w:after="120" w:line="276"/>
-        <w:jc w:val="both"/>
-      </w:pPr>
-      <w:r>
-        <w:rPr>
-          <w:i w:val="false"/>
-          <w:iCs w:val="false"/>
-        </w:rPr>
-        <w:t xml:space="preserve">A validação foi realizada por meio de teste de usabilidade com tarefas guiadas e um formulário de coleta, observando dificuldades, facilidade de uso, clareza da interface e sugestões. Foram coletadas, entre outras, métricas de erros por participante e notas de satisfação.</w:t>
-      </w:r>
-    </w:p>
-    <w:p>
-      <w:pPr>
-        <w:spacing w:after="120" w:line="276"/>
-      </w:pPr>
-      <w:r>
-        <w:rPr>
-          <w:b/>
-          <w:bCs/>
-          <w:color w:val="B23B34"/>
-        </w:rPr>
-        <w:t xml:space="preserve">[CONFIRMAR] </w:t>
-      </w:r>
-      <w:r>
-        <w:rPr>
-          <w:i/>
-          <w:iCs/>
-        </w:rPr>
-        <w:t xml:space="preserve">Informar o número real de participantes e a metodologia (presencial/remoto), além de reconciliar os números: o registro mais recente do projeto indica P1 com 5 erros e satisfação 3,5/5 e P2 com 5 erros e satisfação 4,75/5; confirmar se esses são os valores definitivos.</w:t>
-      </w:r>
-    </w:p>
-    <w:p>
-      <w:pPr>
-        <w:pStyle w:val="Heading2"/>
-      </w:pPr>
-      <w:r>
-        <w:t xml:space="preserve">9.1. Perguntas aplicadas</w:t>
+        <w:t xml:space="preserve">Aviso de “compra simulada” no checkout e confirmação obrigatória antes de finalizar, evitando que o usuário pense tratar-se de um pagamento real.</w:t>
       </w:r>
     </w:p>
     <w:p>
@@ -4044,7 +3995,7 @@
         <w:spacing w:after="60" w:line="270"/>
       </w:pPr>
       <w:r>
-        <w:t xml:space="preserve">Você conseguiu encontrar um produto com facilidade?</w:t>
+        <w:t xml:space="preserve">Mostrar/ocultar senha e mensagem de login genérica, que não revela se um e-mail está cadastrado (redução de exposição de informação).</w:t>
       </w:r>
     </w:p>
     <w:p>
@@ -4057,7 +4008,56 @@
         <w:spacing w:after="60" w:line="270"/>
       </w:pPr>
       <w:r>
-        <w:t xml:space="preserve">A barra de busca ficou clara?</w:t>
+        <w:t xml:space="preserve">Banner de protótipo no rodapé, reforçando que os dados ficam apenas no navegador e podem ser apagados.</w:t>
+      </w:r>
+    </w:p>
+    <w:p>
+      <w:pPr>
+        <w:pStyle w:val="Heading1"/>
+      </w:pPr>
+      <w:r>
+        <w:t xml:space="preserve">9. Validação com usuários</w:t>
+      </w:r>
+    </w:p>
+    <w:p>
+      <w:pPr>
+        <w:spacing w:after="120" w:line="276"/>
+        <w:jc w:val="both"/>
+      </w:pPr>
+      <w:r>
+        <w:rPr>
+          <w:i w:val="false"/>
+          <w:iCs w:val="false"/>
+        </w:rPr>
+        <w:t xml:space="preserve">A validação foi realizada por meio de teste de usabilidade com tarefas guiadas e um formulário de coleta, observando dificuldades, facilidade de uso, clareza da interface e sugestões. Foram coletadas, entre outras, métricas de erros por participante e notas de satisfação.</w:t>
+      </w:r>
+    </w:p>
+    <w:p>
+      <w:pPr>
+        <w:spacing w:after="120" w:line="276"/>
+      </w:pPr>
+      <w:r>
+        <w:rPr>
+          <w:b/>
+          <w:bCs/>
+          <w:color w:val="B23B34"/>
+        </w:rPr>
+        <w:t xml:space="preserve">[CONFIRMAR] </w:t>
+      </w:r>
+      <w:r>
+        <w:rPr>
+          <w:i/>
+          <w:iCs/>
+        </w:rPr>
+        <w:t xml:space="preserve">Informar o número real de participantes e a metodologia (presencial/remoto), além de reconciliar os números: o registro mais recente do projeto indica P1 com 5 erros e satisfação 3,5/5 e P2 com 5 erros e satisfação 4,75/5; confirmar se esses são os valores definitivos.</w:t>
+      </w:r>
+    </w:p>
+    <w:p>
+      <w:pPr>
+        <w:pStyle w:val="Heading2"/>
+      </w:pPr>
+      <w:r>
+        <w:t xml:space="preserve">9.1. Perguntas aplicadas</w:t>
       </w:r>
     </w:p>
     <w:p>
@@ -4070,7 +4070,7 @@
         <w:spacing w:after="60" w:line="270"/>
       </w:pPr>
       <w:r>
-        <w:t xml:space="preserve">Você percebeu quando o produto foi adicionado ao carrinho?</w:t>
+        <w:t xml:space="preserve">Você conseguiu encontrar um produto com facilidade?</w:t>
       </w:r>
     </w:p>
     <w:p>
@@ -4083,7 +4083,7 @@
         <w:spacing w:after="60" w:line="270"/>
       </w:pPr>
       <w:r>
-        <w:t xml:space="preserve">O processo de finalização da compra foi claro?</w:t>
+        <w:t xml:space="preserve">A barra de busca ficou clara?</w:t>
       </w:r>
     </w:p>
     <w:p>
@@ -4096,7 +4096,7 @@
         <w:spacing w:after="60" w:line="270"/>
       </w:pPr>
       <w:r>
-        <w:t xml:space="preserve">Alguma mensagem de erro ficou confusa?</w:t>
+        <w:t xml:space="preserve">Você percebeu quando o produto foi adicionado ao carrinho?</w:t>
       </w:r>
     </w:p>
     <w:p>
@@ -4109,7 +4109,7 @@
         <w:spacing w:after="60" w:line="270"/>
       </w:pPr>
       <w:r>
-        <w:t xml:space="preserve">De 1 a 5, qual a facilidade de uso? E a clareza da interface?</w:t>
+        <w:t xml:space="preserve">O processo de finalização da compra foi claro?</w:t>
       </w:r>
     </w:p>
     <w:p>
@@ -4122,6 +4122,32 @@
         <w:spacing w:after="60" w:line="270"/>
       </w:pPr>
       <w:r>
+        <w:t xml:space="preserve">Alguma mensagem de erro ficou confusa?</w:t>
+      </w:r>
+    </w:p>
+    <w:p>
+      <w:pPr>
+        <w:pStyle w:val="ListParagraph"/>
+        <w:numPr>
+          <w:ilvl w:val="0"/>
+          <w:numId w:val="2"/>
+        </w:numPr>
+        <w:spacing w:after="60" w:line="270"/>
+      </w:pPr>
+      <w:r>
+        <w:t xml:space="preserve">De 1 a 5, qual a facilidade de uso? E a clareza da interface?</w:t>
+      </w:r>
+    </w:p>
+    <w:p>
+      <w:pPr>
+        <w:pStyle w:val="ListParagraph"/>
+        <w:numPr>
+          <w:ilvl w:val="0"/>
+          <w:numId w:val="2"/>
+        </w:numPr>
+        <w:spacing w:after="60" w:line="270"/>
+      </w:pPr>
+      <w:r>
         <w:t xml:space="preserve">O que você melhoraria?</w:t>
       </w:r>
     </w:p>
@@ -4210,7 +4236,7 @@
           <w:i w:val="false"/>
           <w:iCs w:val="false"/>
         </w:rPr>
-        <w:t xml:space="preserve">Mudança realizada: a busca foi tornada mais proeminente e transformada em um combobox acessível, com sugestões automáticas enquanto o usuário digita, estado de “sem resultados” com orientação de recuperação e chips de filtro por categoria nas páginas de listagem.</w:t>
+        <w:t xml:space="preserve">Mudança realizada: a busca foi tornada mais proeminente e transformada em um combobox acessível, com sugestões automáticas enquanto o usuário digita, estado de “sem resultados” com orientação de recuperação. Nas páginas de categoria, além dos chips de navegação, foram disponibilizados filtros por estado, autenticidade e disponibilidade e ordenação por preço, permitindo refinar a lista sem depender apenas da busca.</w:t>
       </w:r>
     </w:p>
     <w:p>

</xml_diff>